<commit_message>
report and the supplu materials
</commit_message>
<xml_diff>
--- a/CSDI-10895055-am.docx
+++ b/CSDI-10895055-am.docx
@@ -66,21 +66,12 @@
           <w:lang w:eastAsia="zh-CN"/>
         </w:rPr>
       </w:pPr>
-      <w:proofErr w:type="spellStart"/>
       <w:r>
         <w:rPr>
           <w:b/>
           <w:sz w:val="21"/>
         </w:rPr>
-        <w:t>Programme</w:t>
-      </w:r>
-      <w:proofErr w:type="spellEnd"/>
-      <w:r>
-        <w:rPr>
-          <w:b/>
-          <w:sz w:val="21"/>
-        </w:rPr>
-        <w:t>: Computer Science Data Informatics</w:t>
+        <w:t>Programme: Computer Science Data Informatics</w:t>
       </w:r>
     </w:p>
     <w:p>
@@ -131,7 +122,7 @@
     <w:p>
       <w:pPr>
         <w:rPr>
-          <w:rFonts w:eastAsia="宋体" w:hint="eastAsia"/>
+          <w:rFonts w:eastAsia="宋体"/>
           <w:lang w:eastAsia="zh-CN"/>
         </w:rPr>
       </w:pPr>
@@ -147,12 +138,12 @@
       </w:r>
       <w:r>
         <w:rPr>
-          <w:rFonts w:eastAsia="宋体" w:hint="eastAsia"/>
+          <w:rFonts w:eastAsia="宋体"/>
           <w:b/>
           <w:bCs/>
           <w:lang w:eastAsia="zh-CN"/>
         </w:rPr>
-        <w:t>A GitHub link is also included</w:t>
+        <w:t>A GitHub link is also included in Section 4.3.</w:t>
       </w:r>
       <w:r>
         <w:rPr>
@@ -161,7 +152,7 @@
           <w:bCs/>
           <w:lang w:eastAsia="zh-CN"/>
         </w:rPr>
-        <w:t xml:space="preserve"> on 4.3.</w:t>
+        <w:t>.</w:t>
       </w:r>
     </w:p>
     <w:p>
@@ -425,14 +416,12 @@
             <w:pPr>
               <w:spacing w:after="0"/>
             </w:pPr>
-            <w:proofErr w:type="spellStart"/>
             <w:r>
               <w:rPr>
                 <w:sz w:val="18"/>
               </w:rPr>
               <w:t>PyTorch</w:t>
             </w:r>
-            <w:proofErr w:type="spellEnd"/>
           </w:p>
         </w:tc>
         <w:tc>
@@ -529,14 +518,12 @@
             <w:pPr>
               <w:spacing w:after="0"/>
             </w:pPr>
-            <w:proofErr w:type="spellStart"/>
             <w:r>
               <w:rPr>
                 <w:sz w:val="18"/>
               </w:rPr>
               <w:t>torchvision</w:t>
             </w:r>
-            <w:proofErr w:type="spellEnd"/>
           </w:p>
         </w:tc>
         <w:tc>
@@ -582,14 +569,12 @@
             <w:pPr>
               <w:spacing w:after="0"/>
             </w:pPr>
-            <w:proofErr w:type="spellStart"/>
             <w:r>
               <w:rPr>
                 <w:sz w:val="18"/>
               </w:rPr>
               <w:t>tqdm</w:t>
             </w:r>
-            <w:proofErr w:type="spellEnd"/>
           </w:p>
         </w:tc>
         <w:tc>
@@ -926,35 +911,7 @@
               <w:rPr>
                 <w:sz w:val="18"/>
               </w:rPr>
-              <w:t xml:space="preserve">Linear; </w:t>
-            </w:r>
-            <w:proofErr w:type="spellStart"/>
-            <w:r>
-              <w:rPr>
-                <w:sz w:val="18"/>
-              </w:rPr>
-              <w:t>beta_start</w:t>
-            </w:r>
-            <w:proofErr w:type="spellEnd"/>
-            <w:r>
-              <w:rPr>
-                <w:sz w:val="18"/>
-              </w:rPr>
-              <w:t xml:space="preserve"> = 1e-4, </w:t>
-            </w:r>
-            <w:proofErr w:type="spellStart"/>
-            <w:r>
-              <w:rPr>
-                <w:sz w:val="18"/>
-              </w:rPr>
-              <w:t>beta_end</w:t>
-            </w:r>
-            <w:proofErr w:type="spellEnd"/>
-            <w:r>
-              <w:rPr>
-                <w:sz w:val="18"/>
-              </w:rPr>
-              <w:t xml:space="preserve"> = 0.02</w:t>
+              <w:t>Linear; beta_start = 1e-4, beta_end = 0.02</w:t>
             </w:r>
           </w:p>
         </w:tc>
@@ -1352,6 +1309,7 @@
               <w:rPr>
                 <w:sz w:val="18"/>
               </w:rPr>
+              <w:lastRenderedPageBreak/>
               <w:t>Bound</w:t>
             </w:r>
           </w:p>
@@ -1426,7 +1384,6 @@
               <w:rPr>
                 <w:sz w:val="18"/>
               </w:rPr>
-              <w:lastRenderedPageBreak/>
               <w:t>Bound</w:t>
             </w:r>
           </w:p>
@@ -1655,19 +1612,11 @@
             <w:pPr>
               <w:spacing w:after="0"/>
             </w:pPr>
-            <w:proofErr w:type="spellStart"/>
             <w:r>
               <w:rPr>
                 <w:sz w:val="16"/>
               </w:rPr>
-              <w:t>diffusion_code</w:t>
-            </w:r>
-            <w:proofErr w:type="spellEnd"/>
-            <w:r>
-              <w:rPr>
-                <w:sz w:val="16"/>
-              </w:rPr>
-              <w:t>/</w:t>
+              <w:t>diffusion_code/</w:t>
             </w:r>
             <w:r>
               <w:rPr>
@@ -1722,19 +1671,11 @@
             <w:pPr>
               <w:spacing w:after="0"/>
             </w:pPr>
-            <w:proofErr w:type="spellStart"/>
             <w:r>
               <w:rPr>
                 <w:sz w:val="16"/>
               </w:rPr>
-              <w:t>diffusion_code_expansion_circle</w:t>
-            </w:r>
-            <w:proofErr w:type="spellEnd"/>
-            <w:r>
-              <w:rPr>
-                <w:sz w:val="16"/>
-              </w:rPr>
-              <w:t>/</w:t>
+              <w:t>diffusion_code_expansion_circle/</w:t>
             </w:r>
             <w:r>
               <w:rPr>
@@ -1789,86 +1730,11 @@
             <w:pPr>
               <w:spacing w:after="0"/>
             </w:pPr>
-            <w:proofErr w:type="spellStart"/>
             <w:r>
               <w:rPr>
                 <w:sz w:val="16"/>
               </w:rPr>
-              <w:t>diffusion_code_expansion_two_moons</w:t>
-            </w:r>
-            <w:proofErr w:type="spellEnd"/>
-            <w:r>
-              <w:rPr>
-                <w:sz w:val="16"/>
-              </w:rPr>
-              <w:t>/</w:t>
-            </w:r>
-            <w:r>
-              <w:rPr>
-                <w:sz w:val="16"/>
-              </w:rPr>
-              <w:br/>
-              <w:t>main_two_moons.py</w:t>
-            </w:r>
-          </w:p>
-        </w:tc>
-        <w:tc>
-          <w:tcPr>
-            <w:tcW w:w="2920" w:type="dxa"/>
-            <w:tcMar>
-              <w:top w:w="80" w:type="dxa"/>
-              <w:left w:w="120" w:type="dxa"/>
-              <w:bottom w:w="80" w:type="dxa"/>
-              <w:right w:w="120" w:type="dxa"/>
-            </w:tcMar>
-            <w:vAlign w:val="center"/>
-          </w:tcPr>
-          <w:p>
-            <w:pPr>
-              <w:spacing w:after="0"/>
-            </w:pPr>
-            <w:r>
-              <w:rPr>
-                <w:sz w:val="16"/>
-              </w:rPr>
-              <w:t>Rescaled two moons with U[-0.05, 0.05] coordinate noise</w:t>
-            </w:r>
-          </w:p>
-        </w:tc>
-      </w:tr>
-      <w:tr>
-        <w:trPr>
-          <w:cantSplit/>
-          <w:jc w:val="center"/>
-        </w:trPr>
-        <w:tc>
-          <w:tcPr>
-            <w:tcW w:w="2550" w:type="dxa"/>
-            <w:tcMar>
-              <w:top w:w="80" w:type="dxa"/>
-              <w:left w:w="120" w:type="dxa"/>
-              <w:bottom w:w="80" w:type="dxa"/>
-              <w:right w:w="120" w:type="dxa"/>
-            </w:tcMar>
-            <w:vAlign w:val="center"/>
-          </w:tcPr>
-          <w:p>
-            <w:pPr>
-              <w:spacing w:after="0"/>
-            </w:pPr>
-            <w:proofErr w:type="spellStart"/>
-            <w:r>
-              <w:rPr>
-                <w:sz w:val="16"/>
-              </w:rPr>
-              <w:t>diffusion_code_expansion_checkerboard</w:t>
-            </w:r>
-            <w:proofErr w:type="spellEnd"/>
-            <w:r>
-              <w:rPr>
-                <w:sz w:val="16"/>
-              </w:rPr>
-              <w:t>/</w:t>
+              <w:t>diffusion_code_expansion_checkerboard/</w:t>
             </w:r>
             <w:r>
               <w:rPr>
@@ -1923,19 +1789,11 @@
             <w:pPr>
               <w:spacing w:after="0"/>
             </w:pPr>
-            <w:proofErr w:type="spellStart"/>
             <w:r>
               <w:rPr>
                 <w:sz w:val="16"/>
               </w:rPr>
-              <w:t>two_moons_shape</w:t>
-            </w:r>
-            <w:proofErr w:type="spellEnd"/>
-            <w:r>
-              <w:rPr>
-                <w:sz w:val="16"/>
-              </w:rPr>
-              <w:t>/</w:t>
+              <w:t>two_moons_shape/</w:t>
             </w:r>
             <w:r>
               <w:rPr>
@@ -1979,12 +1837,33 @@
     <w:p>
       <w:pPr>
         <w:rPr>
-          <w:rFonts w:eastAsia="宋体"/>
+          <w:rFonts w:eastAsia="宋体" w:hint="eastAsia"/>
           <w:lang w:eastAsia="zh-CN"/>
         </w:rPr>
       </w:pPr>
       <w:r>
         <w:t>compute_each_term.py loads the saved model, computes the individual bound terms for all six lambda values, prints them and exports a CSV. The main scripts save the trained model and real/generated sample plots.</w:t>
+      </w:r>
+      <w:r>
+        <w:rPr>
+          <w:rFonts w:eastAsia="宋体" w:hint="eastAsia"/>
+          <w:lang w:eastAsia="zh-CN"/>
+        </w:rPr>
+        <w:t xml:space="preserve"> All datasets are in </w:t>
+      </w:r>
+      <w:r>
+        <w:rPr>
+          <w:sz w:val="16"/>
+        </w:rPr>
+        <w:t>[-1, 1]^2</w:t>
+      </w:r>
+      <w:r>
+        <w:rPr>
+          <w:rFonts w:eastAsia="宋体" w:hint="eastAsia"/>
+          <w:sz w:val="16"/>
+          <w:lang w:eastAsia="zh-CN"/>
+        </w:rPr>
+        <w:t>.</w:t>
       </w:r>
     </w:p>
     <w:p>
@@ -2090,19 +1969,11 @@
             <w:pPr>
               <w:spacing w:after="0"/>
             </w:pPr>
-            <w:proofErr w:type="spellStart"/>
             <w:r>
               <w:rPr>
                 <w:sz w:val="18"/>
               </w:rPr>
-              <w:t>diffusion_code</w:t>
-            </w:r>
-            <w:proofErr w:type="spellEnd"/>
-            <w:r>
-              <w:rPr>
-                <w:sz w:val="18"/>
-              </w:rPr>
-              <w:t>/</w:t>
+              <w:t>diffusion_code/</w:t>
             </w:r>
           </w:p>
         </w:tc>
@@ -2149,19 +2020,11 @@
             <w:pPr>
               <w:spacing w:after="0"/>
             </w:pPr>
-            <w:proofErr w:type="spellStart"/>
             <w:r>
               <w:rPr>
                 <w:sz w:val="18"/>
               </w:rPr>
-              <w:t>diffusion_code_expansion_circle</w:t>
-            </w:r>
-            <w:proofErr w:type="spellEnd"/>
-            <w:r>
-              <w:rPr>
-                <w:sz w:val="18"/>
-              </w:rPr>
-              <w:t>/</w:t>
+              <w:t>diffusion_code_expansion_circle/</w:t>
             </w:r>
           </w:p>
         </w:tc>
@@ -2208,78 +2071,11 @@
             <w:pPr>
               <w:spacing w:after="0"/>
             </w:pPr>
-            <w:proofErr w:type="spellStart"/>
             <w:r>
               <w:rPr>
                 <w:sz w:val="18"/>
               </w:rPr>
-              <w:t>diffusion_code_expansion_two_moons</w:t>
-            </w:r>
-            <w:proofErr w:type="spellEnd"/>
-            <w:r>
-              <w:rPr>
-                <w:sz w:val="18"/>
-              </w:rPr>
-              <w:t>/</w:t>
-            </w:r>
-          </w:p>
-        </w:tc>
-        <w:tc>
-          <w:tcPr>
-            <w:tcW w:w="5560" w:type="dxa"/>
-            <w:tcMar>
-              <w:top w:w="80" w:type="dxa"/>
-              <w:left w:w="120" w:type="dxa"/>
-              <w:bottom w:w="80" w:type="dxa"/>
-              <w:right w:w="120" w:type="dxa"/>
-            </w:tcMar>
-            <w:vAlign w:val="center"/>
-          </w:tcPr>
-          <w:p>
-            <w:pPr>
-              <w:spacing w:after="0"/>
-            </w:pPr>
-            <w:r>
-              <w:rPr>
-                <w:sz w:val="18"/>
-              </w:rPr>
-              <w:t>Initial noisy two-moons extension.</w:t>
-            </w:r>
-          </w:p>
-        </w:tc>
-      </w:tr>
-      <w:tr>
-        <w:trPr>
-          <w:cantSplit/>
-        </w:trPr>
-        <w:tc>
-          <w:tcPr>
-            <w:tcW w:w="3800" w:type="dxa"/>
-            <w:tcMar>
-              <w:top w:w="80" w:type="dxa"/>
-              <w:left w:w="120" w:type="dxa"/>
-              <w:bottom w:w="80" w:type="dxa"/>
-              <w:right w:w="120" w:type="dxa"/>
-            </w:tcMar>
-            <w:vAlign w:val="center"/>
-          </w:tcPr>
-          <w:p>
-            <w:pPr>
-              <w:spacing w:after="0"/>
-            </w:pPr>
-            <w:proofErr w:type="spellStart"/>
-            <w:r>
-              <w:rPr>
-                <w:sz w:val="18"/>
-              </w:rPr>
-              <w:t>diffusion_code_expansion_checkerboard</w:t>
-            </w:r>
-            <w:proofErr w:type="spellEnd"/>
-            <w:r>
-              <w:rPr>
-                <w:sz w:val="18"/>
-              </w:rPr>
-              <w:t>/</w:t>
+              <w:t>diffusion_code_expansion_checkerboard/</w:t>
             </w:r>
           </w:p>
         </w:tc>
@@ -2326,19 +2122,11 @@
             <w:pPr>
               <w:spacing w:after="0"/>
             </w:pPr>
-            <w:proofErr w:type="spellStart"/>
             <w:r>
               <w:rPr>
                 <w:sz w:val="18"/>
               </w:rPr>
-              <w:t>two_moons_shape</w:t>
-            </w:r>
-            <w:proofErr w:type="spellEnd"/>
-            <w:r>
-              <w:rPr>
-                <w:sz w:val="18"/>
-              </w:rPr>
-              <w:t>/</w:t>
+              <w:t>two_moons_shape/</w:t>
             </w:r>
           </w:p>
         </w:tc>
@@ -2361,7 +2149,7 @@
               <w:rPr>
                 <w:sz w:val="18"/>
               </w:rPr>
-              <w:t>Later corrected two-moons geometry without additive noise.</w:t>
+              <w:t>Final two-moons extension without additive noise.</w:t>
             </w:r>
           </w:p>
         </w:tc>
@@ -2390,7 +2178,6 @@
         <w:pStyle w:val="Heading2"/>
       </w:pPr>
       <w:r>
-        <w:lastRenderedPageBreak/>
         <w:t>4.2 Main source files</w:t>
       </w:r>
     </w:p>
@@ -2536,6 +2323,7 @@
               <w:rPr>
                 <w:sz w:val="18"/>
               </w:rPr>
+              <w:lastRenderedPageBreak/>
               <w:t>compute_each_term.py</w:t>
             </w:r>
           </w:p>
@@ -2740,57 +2528,6 @@
               <w:rPr>
                 <w:sz w:val="18"/>
               </w:rPr>
-              <w:t>load_and_run*.py</w:t>
-            </w:r>
-          </w:p>
-        </w:tc>
-        <w:tc>
-          <w:tcPr>
-            <w:tcW w:w="6360" w:type="dxa"/>
-            <w:tcMar>
-              <w:top w:w="80" w:type="dxa"/>
-              <w:left w:w="120" w:type="dxa"/>
-              <w:bottom w:w="80" w:type="dxa"/>
-              <w:right w:w="120" w:type="dxa"/>
-            </w:tcMar>
-            <w:vAlign w:val="center"/>
-          </w:tcPr>
-          <w:p>
-            <w:pPr>
-              <w:spacing w:after="0"/>
-            </w:pPr>
-            <w:r>
-              <w:rPr>
-                <w:sz w:val="18"/>
-              </w:rPr>
-              <w:t>Older loading and diagnostic helpers.</w:t>
-            </w:r>
-          </w:p>
-        </w:tc>
-      </w:tr>
-      <w:tr>
-        <w:trPr>
-          <w:cantSplit/>
-        </w:trPr>
-        <w:tc>
-          <w:tcPr>
-            <w:tcW w:w="3000" w:type="dxa"/>
-            <w:tcMar>
-              <w:top w:w="80" w:type="dxa"/>
-              <w:left w:w="120" w:type="dxa"/>
-              <w:bottom w:w="80" w:type="dxa"/>
-              <w:right w:w="120" w:type="dxa"/>
-            </w:tcMar>
-            <w:vAlign w:val="center"/>
-          </w:tcPr>
-          <w:p>
-            <w:pPr>
-              <w:spacing w:after="0"/>
-            </w:pPr>
-            <w:r>
-              <w:rPr>
-                <w:sz w:val="18"/>
-              </w:rPr>
               <w:t>replicate_table.py / plot_comparison.py</w:t>
             </w:r>
           </w:p>
@@ -2885,7 +2622,31 @@
         <w:pStyle w:val="ListNumber"/>
       </w:pPr>
       <w:r>
-        <w:t>Run compute_each_term.py with the trained model. Use --model when the filename differs from the default.</w:t>
+        <w:t xml:space="preserve">Run compute_each_term.py with the </w:t>
+      </w:r>
+      <w:r>
+        <w:rPr>
+          <w:rFonts w:eastAsia="宋体"/>
+          <w:lang w:eastAsia="zh-CN"/>
+        </w:rPr>
+        <w:t>substituted</w:t>
+      </w:r>
+      <w:r>
+        <w:rPr>
+          <w:rFonts w:eastAsia="宋体" w:hint="eastAsia"/>
+          <w:lang w:eastAsia="zh-CN"/>
+        </w:rPr>
+        <w:t xml:space="preserve"> </w:t>
+      </w:r>
+      <w:r>
+        <w:t>trained model</w:t>
+      </w:r>
+      <w:r>
+        <w:rPr>
+          <w:rFonts w:eastAsia="宋体" w:hint="eastAsia"/>
+          <w:lang w:eastAsia="zh-CN"/>
+        </w:rPr>
+        <w:t xml:space="preserve"> parameter in the parse_args() function , and target output csv filename. </w:t>
       </w:r>
     </w:p>
     <w:p>
@@ -3208,7 +2969,6 @@
           <w:rFonts w:eastAsia="宋体" w:hint="eastAsia"/>
           <w:lang w:eastAsia="zh-CN"/>
         </w:rPr>
-        <w:lastRenderedPageBreak/>
         <w:t>7</w:t>
       </w:r>
       <w:r>
@@ -3234,23 +2994,15 @@
           <w:rFonts w:eastAsia="宋体"/>
           <w:lang w:eastAsia="zh-CN"/>
         </w:rPr>
-        <w:t xml:space="preserve">No global random seed was fixed in the reported experiments. Training therefore depends on random network </w:t>
+        <w:t xml:space="preserve">No global random seed was fixed in the reported experiments. Training therefore depends on random network initialisation, minibatch ordering, sampled diffusion time steps and Gaussian noise. Certificate evaluation also uses newly generated certification samples and stochastic reverse </w:t>
       </w:r>
-      <w:proofErr w:type="spellStart"/>
       <w:r>
         <w:rPr>
           <w:rFonts w:eastAsia="宋体"/>
           <w:lang w:eastAsia="zh-CN"/>
         </w:rPr>
-        <w:t>initialisation</w:t>
-      </w:r>
-      <w:proofErr w:type="spellEnd"/>
-      <w:r>
-        <w:rPr>
-          <w:rFonts w:eastAsia="宋体"/>
-          <w:lang w:eastAsia="zh-CN"/>
-        </w:rPr>
-        <w:t>, minibatch ordering, sampled diffusion time steps and Gaussian noise. Certificate evaluation also uses newly generated certification samples and stochastic reverse trajectories. Consequently, independent executions are not expected to reproduce exactly identical numerical values. The archived result folders are supplied as reference outputs from the runs reported in the dissertation.</w:t>
+        <w:lastRenderedPageBreak/>
+        <w:t>trajectories. Consequently, independent executions are not expected to reproduce exactly identical numerical values. The archived result folders are supplied as reference outputs from the runs reported in the dissertation.</w:t>
       </w:r>
     </w:p>
     <w:p>
@@ -4184,7 +3936,6 @@
   <w:style w:type="character" w:default="1" w:styleId="DefaultParagraphFont">
     <w:name w:val="Default Paragraph Font"/>
     <w:uiPriority w:val="1"/>
-    <w:semiHidden/>
     <w:unhideWhenUsed/>
   </w:style>
   <w:style w:type="table" w:default="1" w:styleId="TableNormal">

</xml_diff>